<commit_message>
docs(registros): tabelas de equipe idênticas (roster canônico) em TAP/INTAKE; Lucas como Desenvolvedor
Co-Authored-By: Claude Opus 4.8 (1M context) <noreply@anthropic.com>
</commit_message>
<xml_diff>
--- a/mps-nivel-c/oficial/04_registros/AASP_Andamento-Processuais/INTAKE-PROJETO_AASPAP01_v1.0.docx
+++ b/mps-nivel-c/oficial/04_registros/AASP_Andamento-Processuais/INTAKE-PROJETO_AASPAP01_v1.0.docx
@@ -1183,15 +1183,7 @@
           </w:tcPr>
           <w:p>
             <w:r>
-              <w:rPr>
-                <w:rFonts w:ascii="Arial" w:cs="Arial" w:eastAsia="Arial" w:hAnsi="Arial"/>
-                <w:b w:val="false"/>
-                <w:bCs w:val="false"/>
-                <w:color w:val="000000"/>
-                <w:sz w:val="19"/>
-                <w:szCs w:val="19"/>
-              </w:rPr>
-              <w:t xml:space="preserve">Gerente de Projeto</w:t>
+              <w:t>Gerente de Projeto</w:t>
             </w:r>
           </w:p>
         </w:tc>
@@ -1238,15 +1230,7 @@
           </w:tcPr>
           <w:p>
             <w:r>
-              <w:rPr>
-                <w:rFonts w:ascii="Arial" w:cs="Arial" w:eastAsia="Arial" w:hAnsi="Arial"/>
-                <w:b w:val="false"/>
-                <w:bCs w:val="false"/>
-                <w:color w:val="000000"/>
-                <w:sz w:val="19"/>
-                <w:szCs w:val="19"/>
-              </w:rPr>
-              <w:t xml:space="preserve">Tech Lead / Arquiteto</w:t>
+              <w:t>Tech Lead / DevOps / Arquiteto</w:t>
             </w:r>
           </w:p>
         </w:tc>
@@ -1269,15 +1253,7 @@
           </w:tcPr>
           <w:p>
             <w:r>
-              <w:rPr>
-                <w:rFonts w:ascii="Arial" w:cs="Arial" w:eastAsia="Arial" w:hAnsi="Arial"/>
-                <w:b w:val="false"/>
-                <w:bCs w:val="false"/>
-                <w:color w:val="000000"/>
-                <w:sz w:val="19"/>
-                <w:szCs w:val="19"/>
-              </w:rPr>
-              <w:t>Cézar Hiraki Velázquez (acumula Tech Lead, DevOps e Arquiteto)</w:t>
+              <w:t>Cézar Hiraki Velázquez</w:t>
             </w:r>
           </w:p>
         </w:tc>
@@ -1301,15 +1277,7 @@
           </w:tcPr>
           <w:p>
             <w:r>
-              <w:rPr>
-                <w:rFonts w:ascii="Arial" w:cs="Arial" w:eastAsia="Arial" w:hAnsi="Arial"/>
-                <w:b w:val="false"/>
-                <w:bCs w:val="false"/>
-                <w:color w:val="000000"/>
-                <w:sz w:val="19"/>
-                <w:szCs w:val="19"/>
-              </w:rPr>
-              <w:t xml:space="preserve">Desenvolvedor Sênior (Principal)</w:t>
+              <w:t>Desenvolvedor Sênior (Principal)</w:t>
             </w:r>
           </w:p>
         </w:tc>
@@ -1331,15 +1299,7 @@
           </w:tcPr>
           <w:p>
             <w:r>
-              <w:rPr>
-                <w:rFonts w:ascii="Arial" w:cs="Arial" w:eastAsia="Arial" w:hAnsi="Arial"/>
-                <w:b w:val="false"/>
-                <w:bCs w:val="false"/>
-                <w:color w:val="000000"/>
-                <w:sz w:val="19"/>
-                <w:szCs w:val="19"/>
-              </w:rPr>
-              <w:t xml:space="preserve">Raony Chagas</w:t>
+              <w:t>Raony Chagas</w:t>
             </w:r>
           </w:p>
         </w:tc>
@@ -1364,15 +1324,7 @@
           </w:tcPr>
           <w:p>
             <w:r>
-              <w:rPr>
-                <w:rFonts w:ascii="Arial" w:cs="Arial" w:eastAsia="Arial" w:hAnsi="Arial"/>
-                <w:b w:val="false"/>
-                <w:bCs w:val="false"/>
-                <w:color w:val="000000"/>
-                <w:sz w:val="19"/>
-                <w:szCs w:val="19"/>
-              </w:rPr>
-              <w:t xml:space="preserve">Desenvolvedor (Suporte)</w:t>
+              <w:t>Desenvolvedor</w:t>
             </w:r>
           </w:p>
         </w:tc>
@@ -1395,15 +1347,7 @@
           </w:tcPr>
           <w:p>
             <w:r>
-              <w:rPr>
-                <w:rFonts w:ascii="Arial" w:cs="Arial" w:eastAsia="Arial" w:hAnsi="Arial"/>
-                <w:b w:val="false"/>
-                <w:bCs w:val="false"/>
-                <w:color w:val="000000"/>
-                <w:sz w:val="19"/>
-                <w:szCs w:val="19"/>
-              </w:rPr>
-              <w:t>Mateus Veloso (incorporado em Abr/2026)</w:t>
+              <w:t>Mateus Veloso</w:t>
             </w:r>
           </w:p>
         </w:tc>
@@ -1427,15 +1371,7 @@
           </w:tcPr>
           <w:p>
             <w:r>
-              <w:rPr>
-                <w:rFonts w:ascii="Arial" w:cs="Arial" w:eastAsia="Arial" w:hAnsi="Arial"/>
-                <w:b w:val="false"/>
-                <w:bCs w:val="false"/>
-                <w:color w:val="000000"/>
-                <w:sz w:val="19"/>
-                <w:szCs w:val="19"/>
-              </w:rPr>
-              <w:t xml:space="preserve">QA / Testes</w:t>
+              <w:t>Desenvolvedor</w:t>
             </w:r>
           </w:p>
         </w:tc>
@@ -1457,15 +1393,7 @@
           </w:tcPr>
           <w:p>
             <w:r>
-              <w:rPr>
-                <w:rFonts w:ascii="Arial" w:cs="Arial" w:eastAsia="Arial" w:hAnsi="Arial"/>
-                <w:b w:val="false"/>
-                <w:bCs w:val="false"/>
-                <w:color w:val="000000"/>
-                <w:sz w:val="19"/>
-                <w:szCs w:val="19"/>
-              </w:rPr>
-              <w:t xml:space="preserve">Caroline Sousa</w:t>
+              <w:t>Lucas Batista</w:t>
             </w:r>
           </w:p>
         </w:tc>
@@ -1490,15 +1418,7 @@
           </w:tcPr>
           <w:p>
             <w:r>
-              <w:rPr>
-                <w:rFonts w:ascii="Arial" w:cs="Arial" w:eastAsia="Arial" w:hAnsi="Arial"/>
-                <w:b w:val="false"/>
-                <w:bCs w:val="false"/>
-                <w:color w:val="000000"/>
-                <w:sz w:val="19"/>
-                <w:szCs w:val="19"/>
-              </w:rPr>
-              <w:t xml:space="preserve">DevOps / Infraestrutura</w:t>
+              <w:t>Analista de QA</w:t>
             </w:r>
           </w:p>
         </w:tc>
@@ -1521,15 +1441,7 @@
           </w:tcPr>
           <w:p>
             <w:r>
-              <w:rPr>
-                <w:rFonts w:ascii="Arial" w:cs="Arial" w:eastAsia="Arial" w:hAnsi="Arial"/>
-                <w:b w:val="false"/>
-                <w:bCs w:val="false"/>
-                <w:color w:val="000000"/>
-                <w:sz w:val="19"/>
-                <w:szCs w:val="19"/>
-              </w:rPr>
-              <w:t xml:space="preserve">Lucas Batista (Fase 2 e Fase 5)</w:t>
+              <w:t>Caroline Sousa</w:t>
             </w:r>
           </w:p>
         </w:tc>
@@ -1553,15 +1465,7 @@
           </w:tcPr>
           <w:p>
             <w:r>
-              <w:rPr>
-                <w:rFonts w:ascii="Arial" w:cs="Arial" w:eastAsia="Arial" w:hAnsi="Arial"/>
-                <w:b w:val="false"/>
-                <w:bCs w:val="false"/>
-                <w:color w:val="000000"/>
-                <w:sz w:val="19"/>
-                <w:szCs w:val="19"/>
-              </w:rPr>
-              <w:t xml:space="preserve">Designer UX/UI</w:t>
+              <w:t>Auditor GQA (independente)</w:t>
             </w:r>
           </w:p>
         </w:tc>
@@ -1583,79 +1487,7 @@
           </w:tcPr>
           <w:p>
             <w:r>
-              <w:rPr>
-                <w:rFonts w:ascii="Arial" w:cs="Arial" w:eastAsia="Arial" w:hAnsi="Arial"/>
-                <w:b w:val="false"/>
-                <w:bCs w:val="false"/>
-                <w:color w:val="000000"/>
-                <w:sz w:val="19"/>
-                <w:szCs w:val="19"/>
-              </w:rPr>
-              <w:t xml:space="preserve">Não aplicável (projeto de backend/refatoração)</w:t>
-            </w:r>
-          </w:p>
-        </w:tc>
-      </w:tr>
-      <w:tr>
-        <w:tc>
-          <w:tcPr>
-            <w:tcW w:type="dxa" w:w="3069"/>
-            <w:tcBorders>
-              <w:top w:val="single" w:color="BBBBBB" w:sz="1"/>
-              <w:left w:val="single" w:color="BBBBBB" w:sz="1"/>
-              <w:bottom w:val="single" w:color="BBBBBB" w:sz="1"/>
-              <w:right w:val="single" w:color="BBBBBB" w:sz="1"/>
-            </w:tcBorders>
-            <w:shd w:fill="F2F5FB" w:val="clear"/>
-            <w:tcMar>
-              <w:top w:type="dxa" w:w="60"/>
-              <w:left w:type="dxa" w:w="120"/>
-              <w:bottom w:type="dxa" w:w="60"/>
-              <w:right w:type="dxa" w:w="120"/>
-            </w:tcMar>
-          </w:tcPr>
-          <w:p>
-            <w:r>
-              <w:rPr>
-                <w:rFonts w:ascii="Arial" w:cs="Arial" w:eastAsia="Arial" w:hAnsi="Arial"/>
-                <w:b w:val="false"/>
-                <w:bCs w:val="false"/>
-                <w:color w:val="000000"/>
-                <w:sz w:val="19"/>
-                <w:szCs w:val="19"/>
-              </w:rPr>
-              <w:t xml:space="preserve">Auditor GQA</w:t>
-            </w:r>
-          </w:p>
-        </w:tc>
-        <w:tc>
-          <w:tcPr>
-            <w:tcW w:type="dxa" w:w="5957"/>
-            <w:tcBorders>
-              <w:top w:val="single" w:color="BBBBBB" w:sz="1"/>
-              <w:left w:val="single" w:color="BBBBBB" w:sz="1"/>
-              <w:bottom w:val="single" w:color="BBBBBB" w:sz="1"/>
-              <w:right w:val="single" w:color="BBBBBB" w:sz="1"/>
-            </w:tcBorders>
-            <w:shd w:fill="F2F5FB" w:val="clear"/>
-            <w:tcMar>
-              <w:top w:type="dxa" w:w="60"/>
-              <w:left w:type="dxa" w:w="120"/>
-              <w:bottom w:type="dxa" w:w="60"/>
-              <w:right w:type="dxa" w:w="120"/>
-            </w:tcMar>
-          </w:tcPr>
-          <w:p>
-            <w:r>
-              <w:rPr>
-                <w:rFonts w:ascii="Arial" w:cs="Arial" w:eastAsia="Arial" w:hAnsi="Arial"/>
-                <w:b w:val="false"/>
-                <w:bCs w:val="false"/>
-                <w:color w:val="000000"/>
-                <w:sz w:val="19"/>
-                <w:szCs w:val="19"/>
-              </w:rPr>
-              <w:t xml:space="preserve">Jonathan Barbosa (independente da equipe de projeto)</w:t>
+              <w:t>Jonathan Barbosa</w:t>
             </w:r>
           </w:p>
         </w:tc>

</xml_diff>